<commit_message>
docs: refresh README screenshots for 2.0
- hero: band app pages for Claude / Codex / Antigravity / ZCode
- overview page screenshot under 功能
- new MiniBar screenshot (edge dock + Codex detail); the pairing guide and
  its docx pick it up too

Co-Authored-By: Claude Opus 5 <noreply@anthropic.com>
</commit_message>
<xml_diff>
--- a/docs/手环配对指南.docx
+++ b/docs/手环配对指南.docx
@@ -336,7 +336,7 @@
             <w:r>
               <w:t xml:space="preserve">从 </w:t>
             </w:r>
-            <w:hyperlink w:history="1" r:id="rIdc8xcm3xcg3aqt7k80xoag">
+            <w:hyperlink w:history="1" r:id="rIdi0tk6gft7srv6n1noltmg">
               <w:r>
                 <w:rPr>
                   <w:rStyle w:val="Hyperlink"/>
@@ -814,7 +814,7 @@
       <w:r>
         <w:t xml:space="preserve">连接失败时，参考</w:t>
       </w:r>
-      <w:hyperlink w:history="1" r:id="rIdj7r0b_yp7zw2h_6ltdumr">
+      <w:hyperlink w:history="1" r:id="rIdt3enpqgraizt2gevudhzv">
         <w:r>
           <w:rPr>
             <w:rStyle w:val="Hyperlink"/>
@@ -1010,7 +1010,7 @@
       <w:r>
         <w:drawing>
           <wp:inline distT="0" distB="0" distL="0" distR="0">
-            <wp:extent cx="4933950" cy="3429000"/>
+            <wp:extent cx="5286375" cy="4857750"/>
             <wp:effectExtent t="0" r="0" b="0" l="0"/>
             <wp:docPr id="1" name="Pulse 桌面悬浮窗" descr="Pulse 桌面悬浮窗" title="Pulse 桌面悬浮窗"/>
             <wp:cNvGraphicFramePr>
@@ -1035,7 +1035,7 @@
                   <pic:spPr bwMode="auto">
                     <a:xfrm>
                       <a:off x="0" y="0"/>
-                      <a:ext cx="4933950" cy="3429000"/>
+                      <a:ext cx="5286375" cy="4857750"/>
                     </a:xfrm>
                     <a:prstGeom prst="rect">
                       <a:avLst/>

</xml_diff>